<commit_message>
Rework worksheet: one graph per task (x, v, a), move answers out of document
Co-Authored-By: Claude Opus 5.5 <noreply@anthropic.com>
Claude-Session: https://claude.ai/code/session_01Gj23nN7eTqGj1T4aRx9TGK
</commit_message>
<xml_diff>
--- a/zadanie/Kinematika_grafiki_9klass.docx
+++ b/zadanie/Kinematika_grafiki_9klass.docx
@@ -15,7 +15,7 @@
         <w:spacing w:after="100"/>
       </w:pPr>
       <w:r>
-        <w:t xml:space="preserve">9 класс, профильный уровень. Три задания с выбором всех верных утверждений, ответы с решениями и памятка по чтению графиков.</w:t>
+        <w:t xml:space="preserve">9 класс, профильный уровень. Три задания: к каждому дан один график — x(t), vₓ(t) или aₓ(t). В конце — памятка по чтению графиков.</w:t>
       </w:r>
     </w:p>
     <w:p>
@@ -30,7 +30,7 @@
         <w:t xml:space="preserve">Как работать.</w:t>
       </w:r>
       <w:r>
-        <w:t xml:space="preserve"> В каждом задании все три графика описывают одно и то же движение одного тела вдоль оси OX (в задании 3 есть подвох, он описан в условии). Выберите </w:t>
+        <w:t xml:space="preserve"> По графику и данным из условия выберите </w:t>
       </w:r>
       <w:r>
         <w:rPr>
@@ -48,7 +48,7 @@
         <w:pStyle w:val="Heading1"/>
       </w:pPr>
       <w:r>
-        <w:t xml:space="preserve">Задание 1</w:t>
+        <w:t xml:space="preserve">Задание 1. График x(t)</w:t>
       </w:r>
     </w:p>
     <w:p>
@@ -56,7 +56,7 @@
         <w:spacing w:after="100"/>
       </w:pPr>
       <w:r>
-        <w:t xml:space="preserve">Тело движется вдоль оси OX. На рисунке показаны графики зависимости координаты x, проекции скорости vₓ и проекции ускорения aₓ от времени t.</w:t>
+        <w:t xml:space="preserve">Тело движется вдоль оси OX. На рисунке показан график зависимости координаты x тела от времени t. На участках 0–2 с и 4–8 с график — части парабол, вершины которых находятся в точках t = 0 и t = 6 с. На участках 2–4 с и 8–10 с график — отрезки прямых.</w:t>
       </w:r>
     </w:p>
     <w:p>
@@ -67,7 +67,7 @@
       <w:r>
         <w:drawing>
           <wp:inline distT="0" distB="0" distL="0" distR="0">
-            <wp:extent cx="3143250" cy="4838700"/>
+            <wp:extent cx="5334000" cy="3505200"/>
             <wp:effectExtent t="0" r="0" b="0" l="0"/>
             <wp:docPr id="1" name="" descr="" title=""/>
             <wp:cNvGraphicFramePr>
@@ -92,7 +92,7 @@
                   <pic:spPr bwMode="auto">
                     <a:xfrm>
                       <a:off x="0" y="0"/>
-                      <a:ext cx="3143250" cy="4838700"/>
+                      <a:ext cx="5334000" cy="3505200"/>
                     </a:xfrm>
                     <a:prstGeom prst="rect">
                       <a:avLst/>
@@ -129,7 +129,7 @@
         <w:ind w:left="360" w:hanging="360"/>
       </w:pPr>
       <w:r>
-        <w:t xml:space="preserve">1) В момент t = 2 с тело остановилось и начало двигаться в обратном направлении.</w:t>
+        <w:t xml:space="preserve">1) Начальная скорость тела равна нулю.</w:t>
       </w:r>
     </w:p>
     <w:p>
@@ -138,7 +138,7 @@
         <w:ind w:left="360" w:hanging="360"/>
       </w:pPr>
       <w:r>
-        <w:t xml:space="preserve">2) Наименьшее значение координаты тела равно 0 м.</w:t>
+        <w:t xml:space="preserve">2) Модуль ускорения тела в интервале от 0 до 2 с равен 3 м/с².</w:t>
       </w:r>
     </w:p>
     <w:p>
@@ -147,7 +147,7 @@
         <w:ind w:left="360" w:hanging="360"/>
       </w:pPr>
       <w:r>
-        <w:t xml:space="preserve">3) Путь, пройденный телом за первые 5 с, равен 5 м.</w:t>
+        <w:t xml:space="preserve">3) В интервале от 2 до 4 с тело двигалось равномерно со скоростью 3 м/с.</w:t>
       </w:r>
     </w:p>
     <w:p>
@@ -156,7 +156,7 @@
         <w:ind w:left="360" w:hanging="360"/>
       </w:pPr>
       <w:r>
-        <w:t xml:space="preserve">4) В интервале времени от 5 до 7 с модуль ускорения тела равен 6 м/с².</w:t>
+        <w:t xml:space="preserve">4) В момент t = 6 с тело остановилось и начало двигаться в обратном направлении.</w:t>
       </w:r>
     </w:p>
     <w:p>
@@ -165,7 +165,7 @@
         <w:ind w:left="360" w:hanging="360"/>
       </w:pPr>
       <w:r>
-        <w:t xml:space="preserve">5) Путь, пройденный телом за 10 с, равен 34 м.</w:t>
+        <w:t xml:space="preserve">5) Путь, пройденный телом за 10 с, равен 42 м.</w:t>
       </w:r>
     </w:p>
     <w:p>
@@ -174,7 +174,7 @@
         <w:ind w:left="360" w:hanging="360"/>
       </w:pPr>
       <w:r>
-        <w:t xml:space="preserve">6) Средняя путевая скорость тела за 10 с равна 2,6 м/с.</w:t>
+        <w:t xml:space="preserve">6) Перемещение тела за 10 с равно нулю.</w:t>
       </w:r>
     </w:p>
     <w:p>
@@ -183,7 +183,7 @@
         <w:ind w:left="360" w:hanging="360"/>
       </w:pPr>
       <w:r>
-        <w:t xml:space="preserve">7) На участке от 7 до 10 с график x(t) — парабола с ветвями вниз, и в момент t = 10 с находится её вершина.</w:t>
+        <w:t xml:space="preserve">7) Модуль ускорения тела в интервале от 4 до 8 с равен 1,5 м/с².</w:t>
       </w:r>
     </w:p>
     <w:p>
@@ -192,7 +192,7 @@
         <w:ind w:left="360" w:hanging="360"/>
       </w:pPr>
       <w:r>
-        <w:t xml:space="preserve">8) На участке от 0 до 5 с координата тела меняется по закону x = 4 − 4t + 2t².</w:t>
+        <w:t xml:space="preserve">8) В интервале от 8 до 10 с проекция скорости тела равна −6 м/с.</w:t>
       </w:r>
     </w:p>
     <w:p>
@@ -205,7 +205,7 @@
         <w:pStyle w:val="Heading1"/>
       </w:pPr>
       <w:r>
-        <w:t xml:space="preserve">Задание 2</w:t>
+        <w:t xml:space="preserve">Задание 2. График vₓ(t)</w:t>
       </w:r>
     </w:p>
     <w:p>
@@ -213,7 +213,7 @@
         <w:spacing w:after="100"/>
       </w:pPr>
       <w:r>
-        <w:t xml:space="preserve">Тело движется вдоль оси OX. На рисунке показаны графики зависимости координаты x, проекции скорости vₓ и проекции ускорения aₓ от времени t.</w:t>
+        <w:t xml:space="preserve">Тело движется вдоль оси OX. В начальный момент времени координата тела x₀ = 4 м. На рисунке показан график зависимости проекции скорости vₓ тела от времени t.</w:t>
       </w:r>
     </w:p>
     <w:p>
@@ -224,7 +224,7 @@
       <w:r>
         <w:drawing>
           <wp:inline distT="0" distB="0" distL="0" distR="0">
-            <wp:extent cx="3143250" cy="4838700"/>
+            <wp:extent cx="5334000" cy="3505200"/>
             <wp:effectExtent t="0" r="0" b="0" l="0"/>
             <wp:docPr id="1" name="" descr="" title=""/>
             <wp:cNvGraphicFramePr>
@@ -249,7 +249,7 @@
                   <pic:spPr bwMode="auto">
                     <a:xfrm>
                       <a:off x="0" y="0"/>
-                      <a:ext cx="3143250" cy="4838700"/>
+                      <a:ext cx="5334000" cy="3505200"/>
                     </a:xfrm>
                     <a:prstGeom prst="rect">
                       <a:avLst/>
@@ -286,7 +286,7 @@
         <w:ind w:left="360" w:hanging="360"/>
       </w:pPr>
       <w:r>
-        <w:t xml:space="preserve">1) Тело дважды проходило через начало координат: в моменты t = 2 с и t = 10 с.</w:t>
+        <w:t xml:space="preserve">1) В момент t = 2 с тело остановилось и начало двигаться в обратном направлении.</w:t>
       </w:r>
     </w:p>
     <w:p>
@@ -295,7 +295,7 @@
         <w:ind w:left="360" w:hanging="360"/>
       </w:pPr>
       <w:r>
-        <w:t xml:space="preserve">2) Наибольшая координата тела равна 18 м, тело достигло её в момент t = 6 с.</w:t>
+        <w:t xml:space="preserve">2) Наименьшее значение координаты тела равно 0 м.</w:t>
       </w:r>
     </w:p>
     <w:p>
@@ -304,7 +304,7 @@
         <w:ind w:left="360" w:hanging="360"/>
       </w:pPr>
       <w:r>
-        <w:t xml:space="preserve">3) Модуль ускорения тела в интервале от 4 до 8 с больше, чем в интервале от 0 до 2 с.</w:t>
+        <w:t xml:space="preserve">3) Путь, пройденный телом за первые 5 с, равен 5 м.</w:t>
       </w:r>
     </w:p>
     <w:p>
@@ -313,7 +313,7 @@
         <w:ind w:left="360" w:hanging="360"/>
       </w:pPr>
       <w:r>
-        <w:t xml:space="preserve">4) Путь, пройденный телом за 10 с, равен 42 м.</w:t>
+        <w:t xml:space="preserve">4) В интервале времени от 5 до 7 с модуль ускорения тела равен 6 м/с².</w:t>
       </w:r>
     </w:p>
     <w:p>
@@ -322,7 +322,7 @@
         <w:ind w:left="360" w:hanging="360"/>
       </w:pPr>
       <w:r>
-        <w:t xml:space="preserve">5) Перемещение тела за 10 с равно нулю.</w:t>
+        <w:t xml:space="preserve">5) Путь, пройденный телом за 10 с, равен 34 м.</w:t>
       </w:r>
     </w:p>
     <w:p>
@@ -331,7 +331,7 @@
         <w:ind w:left="360" w:hanging="360"/>
       </w:pPr>
       <w:r>
-        <w:t xml:space="preserve">6) В интервале от 4 до 8 с тело всё время тормозило.</w:t>
+        <w:t xml:space="preserve">6) Средняя путевая скорость тела за 10 с равна 2,6 м/с.</w:t>
       </w:r>
     </w:p>
     <w:p>
@@ -340,7 +340,7 @@
         <w:ind w:left="360" w:hanging="360"/>
       </w:pPr>
       <w:r>
-        <w:t xml:space="preserve">7) Модуль средней скорости перемещения тела за 10 с равен 0,6 м/с.</w:t>
+        <w:t xml:space="preserve">7) В момент t = 10 с координата тела равна 30 м.</w:t>
       </w:r>
     </w:p>
     <w:p>
@@ -349,7 +349,7 @@
         <w:ind w:left="360" w:hanging="360"/>
       </w:pPr>
       <w:r>
-        <w:t xml:space="preserve">8) В момент t = 7 с проекция скорости тела равна −3 м/с.</w:t>
+        <w:t xml:space="preserve">8) На участке от 0 до 5 с координата тела меняется по закону x = 4 − 4t + 2t².</w:t>
       </w:r>
     </w:p>
     <w:p>
@@ -362,7 +362,7 @@
         <w:pStyle w:val="Heading1"/>
       </w:pPr>
       <w:r>
-        <w:t xml:space="preserve">Задание 3 (повышенной сложности)</w:t>
+        <w:t xml:space="preserve">Задание 3. График aₓ(t)</w:t>
       </w:r>
     </w:p>
     <w:p>
@@ -370,27 +370,7 @@
         <w:spacing w:after="100"/>
       </w:pPr>
       <w:r>
-        <w:t xml:space="preserve">Ученик построил графики x(t), vₓ(t) и aₓ(t) для одного и того же движения тела вдоль оси OX. В </w:t>
-      </w:r>
-      <w:r>
-        <w:rPr>
-          <w:b/>
-          <w:bCs/>
-        </w:rPr>
-        <w:t xml:space="preserve">одном</w:t>
-      </w:r>
-      <w:r>
-        <w:t xml:space="preserve"> из трёх графиков он допустил ошибку, два других построены верно. Считайте, что тело двигалось так, как показывают </w:t>
-      </w:r>
-      <w:r>
-        <w:rPr>
-          <w:b/>
-          <w:bCs/>
-        </w:rPr>
-        <w:t xml:space="preserve">два верных</w:t>
-      </w:r>
-      <w:r>
-        <w:t xml:space="preserve"> графика.</w:t>
+        <w:t xml:space="preserve">Тело движется вдоль оси OX. В начальный момент времени координата тела x₀ = 2 м, проекция скорости v₀ₓ = −3 м/с. На рисунке показан график зависимости проекции ускорения aₓ тела от времени t.</w:t>
       </w:r>
     </w:p>
     <w:p>
@@ -401,7 +381,7 @@
       <w:r>
         <w:drawing>
           <wp:inline distT="0" distB="0" distL="0" distR="0">
-            <wp:extent cx="3143250" cy="4838700"/>
+            <wp:extent cx="5334000" cy="3505200"/>
             <wp:effectExtent t="0" r="0" b="0" l="0"/>
             <wp:docPr id="1" name="" descr="" title=""/>
             <wp:cNvGraphicFramePr>
@@ -426,7 +406,7 @@
                   <pic:spPr bwMode="auto">
                     <a:xfrm>
                       <a:off x="0" y="0"/>
-                      <a:ext cx="3143250" cy="4838700"/>
+                      <a:ext cx="5334000" cy="3505200"/>
                     </a:xfrm>
                     <a:prstGeom prst="rect">
                       <a:avLst/>
@@ -463,7 +443,7 @@
         <w:ind w:left="360" w:hanging="360"/>
       </w:pPr>
       <w:r>
-        <w:t xml:space="preserve">1) Ошибка допущена в графике aₓ(t).</w:t>
+        <w:t xml:space="preserve">1) В момент t = 2 с скорость тела была равна нулю.</w:t>
       </w:r>
     </w:p>
     <w:p>
@@ -472,7 +452,7 @@
         <w:ind w:left="360" w:hanging="360"/>
       </w:pPr>
       <w:r>
-        <w:t xml:space="preserve">2) Скорость тела была равна нулю в момент t = 2 с и на всём промежутке от 9 до 10 с.</w:t>
+        <w:t xml:space="preserve">2) Наибольшая скорость тела за время движения равна 9 м/с.</w:t>
       </w:r>
     </w:p>
     <w:p>
@@ -481,7 +461,7 @@
         <w:ind w:left="360" w:hanging="360"/>
       </w:pPr>
       <w:r>
-        <w:t xml:space="preserve">3) Наименьшее значение координаты тела равно −1 м.</w:t>
+        <w:t xml:space="preserve">3) В момент t = 9 с тело остановилось и до конца 10-й секунды оставалось в покое.</w:t>
       </w:r>
     </w:p>
     <w:p>
@@ -490,7 +470,7 @@
         <w:ind w:left="360" w:hanging="360"/>
       </w:pPr>
       <w:r>
-        <w:t xml:space="preserve">4) Путь, пройденный телом за 10 с, равен 24 м.</w:t>
+        <w:t xml:space="preserve">4) В интервале от 6 до 9 с тело разгонялось.</w:t>
       </w:r>
     </w:p>
     <w:p>
@@ -499,7 +479,7 @@
         <w:ind w:left="360" w:hanging="360"/>
       </w:pPr>
       <w:r>
-        <w:t xml:space="preserve">5) Перемещение тела за 10 с равно 24 м.</w:t>
+        <w:t xml:space="preserve">5) Наименьшее значение координаты тела равно −1 м.</w:t>
       </w:r>
     </w:p>
     <w:p>
@@ -508,7 +488,7 @@
         <w:ind w:left="360" w:hanging="360"/>
       </w:pPr>
       <w:r>
-        <w:t xml:space="preserve">6) В интервале от 6 до 9 с модуль ускорения тела равен 3 м/с².</w:t>
+        <w:t xml:space="preserve">6) Путь, пройденный телом за 10 с, равен 24 м.</w:t>
       </w:r>
     </w:p>
     <w:p>
@@ -517,7 +497,7 @@
         <w:ind w:left="360" w:hanging="360"/>
       </w:pPr>
       <w:r>
-        <w:t xml:space="preserve">7) Тело дважды проходило через начало координат.</w:t>
+        <w:t xml:space="preserve">7) Перемещение тела за 10 с равно 24 м.</w:t>
       </w:r>
     </w:p>
     <w:p>
@@ -535,651 +515,7 @@
         <w:ind w:left="360" w:hanging="360"/>
       </w:pPr>
       <w:r>
-        <w:t xml:space="preserve">9) На участке от 0 до 6 с координата тела меняется по закону x = 2 − 3t + 0,75t².</w:t>
-      </w:r>
-    </w:p>
-    <w:p>
-      <w:r>
-        <w:br w:type="page"/>
-      </w:r>
-    </w:p>
-    <w:p>
-      <w:pPr>
-        <w:pStyle w:val="Heading1"/>
-      </w:pPr>
-      <w:r>
-        <w:t xml:space="preserve">Ответы и решения</w:t>
-      </w:r>
-    </w:p>
-    <w:p>
-      <w:pPr>
-        <w:pStyle w:val="Heading2"/>
-      </w:pPr>
-      <w:r>
-        <w:t xml:space="preserve">Задание 1</w:t>
-      </w:r>
-    </w:p>
-    <w:p>
-      <w:pPr>
-        <w:pBdr>
-          <w:left w:val="single" w:color="2E5C9A" w:sz="18" w:space="6"/>
-        </w:pBdr>
-        <w:shd w:fill="EAF1FB" w:val="clear"/>
-        <w:spacing w:after="120" w:before="120"/>
-      </w:pPr>
-      <w:r>
-        <w:rPr>
-          <w:b/>
-          <w:bCs/>
-        </w:rPr>
-        <w:t xml:space="preserve">Ответ: 1, 2, 5, 7</w:t>
-      </w:r>
-    </w:p>
-    <w:p>
-      <w:pPr>
-        <w:spacing w:after="100"/>
-      </w:pPr>
-      <w:r>
-        <w:rPr>
-          <w:b/>
-          <w:bCs/>
-        </w:rPr>
-        <w:t xml:space="preserve">Данные с графиков.</w:t>
-      </w:r>
-      <w:r>
-        <w:t xml:space="preserve"> x₀ = 4 м, v₀ₓ = −4 м/с. На участке 0–5 с aₓ = (6 − (−4)) / 5 = 2 м/с², на участке 5–7 с aₓ = 0, на участке 7–10 с aₓ = (0 − 6) / 3 = −2 м/с².</w:t>
-      </w:r>
-    </w:p>
-    <w:p>
-      <w:pPr>
-        <w:spacing w:after="80"/>
-        <w:ind w:left="360" w:hanging="360"/>
-      </w:pPr>
-      <w:r>
-        <w:t xml:space="preserve">1) </w:t>
-      </w:r>
-      <w:r>
-        <w:rPr>
-          <w:b/>
-          <w:bCs/>
-        </w:rPr>
-        <w:t xml:space="preserve">Верно.</w:t>
-      </w:r>
-      <w:r>
-        <w:t xml:space="preserve"> Скорость при t = 2 с проходит через ноль и меняет знак с «−» на «+». Это и есть разворот.</w:t>
-      </w:r>
-    </w:p>
-    <w:p>
-      <w:pPr>
-        <w:spacing w:after="80"/>
-        <w:ind w:left="360" w:hanging="360"/>
-      </w:pPr>
-      <w:r>
-        <w:t xml:space="preserve">2) </w:t>
-      </w:r>
-      <w:r>
-        <w:rPr>
-          <w:b/>
-          <w:bCs/>
-        </w:rPr>
-        <w:t xml:space="preserve">Верно.</w:t>
-      </w:r>
-      <w:r>
-        <w:t xml:space="preserve"> Наименьшая координата там, где тело развернулось. Площадь под vₓ(t) на 0–2 с: −4·2/2 = −4 м, значит x(2) = 4 − 4 = 0 м. Проверка по формуле: x(2) = 4 − 4·2 + 2² = 0.</w:t>
-      </w:r>
-    </w:p>
-    <w:p>
-      <w:pPr>
-        <w:spacing w:after="80"/>
-        <w:ind w:left="360" w:hanging="360"/>
-      </w:pPr>
-      <w:r>
-        <w:t xml:space="preserve">3) </w:t>
-      </w:r>
-      <w:r>
-        <w:rPr>
-          <w:b/>
-          <w:bCs/>
-        </w:rPr>
-        <w:t xml:space="preserve">Неверно.</w:t>
-      </w:r>
-      <w:r>
-        <w:t xml:space="preserve"> Путь — сумма модулей площадей: 0–2 с — 4 м, 2–5 с — 6·3/2 = 9 м, итого 13 м. 5 м — это перемещение: x(5) − x(0) = 9 − 4.</w:t>
-      </w:r>
-    </w:p>
-    <w:p>
-      <w:pPr>
-        <w:spacing w:after="80"/>
-        <w:ind w:left="360" w:hanging="360"/>
-      </w:pPr>
-      <w:r>
-        <w:t xml:space="preserve">4) </w:t>
-      </w:r>
-      <w:r>
-        <w:rPr>
-          <w:b/>
-          <w:bCs/>
-        </w:rPr>
-        <w:t xml:space="preserve">Неверно.</w:t>
-      </w:r>
-      <w:r>
-        <w:t xml:space="preserve"> На 5–7 с скорость постоянна, значит aₓ = 0. 6 — это скорость в м/с, а не ускорение.</w:t>
-      </w:r>
-    </w:p>
-    <w:p>
-      <w:pPr>
-        <w:spacing w:after="80"/>
-        <w:ind w:left="360" w:hanging="360"/>
-      </w:pPr>
-      <w:r>
-        <w:t xml:space="preserve">5) </w:t>
-      </w:r>
-      <w:r>
-        <w:rPr>
-          <w:b/>
-          <w:bCs/>
-        </w:rPr>
-        <w:t xml:space="preserve">Верно.</w:t>
-      </w:r>
-      <w:r>
-        <w:t xml:space="preserve"> 4 + 9 + 6·2 + 6·3/2 = 4 + 9 + 12 + 9 = 34 м.</w:t>
-      </w:r>
-    </w:p>
-    <w:p>
-      <w:pPr>
-        <w:spacing w:after="80"/>
-        <w:ind w:left="360" w:hanging="360"/>
-      </w:pPr>
-      <w:r>
-        <w:t xml:space="preserve">6) </w:t>
-      </w:r>
-      <w:r>
-        <w:rPr>
-          <w:b/>
-          <w:bCs/>
-        </w:rPr>
-        <w:t xml:space="preserve">Неверно.</w:t>
-      </w:r>
-      <w:r>
-        <w:t xml:space="preserve"> Путевая скорость = 34 / 10 = 3,4 м/с. Значение 2,6 м/с — это модуль средней скорости перемещения: (30 − 4) / 10.</w:t>
-      </w:r>
-    </w:p>
-    <w:p>
-      <w:pPr>
-        <w:spacing w:after="80"/>
-        <w:ind w:left="360" w:hanging="360"/>
-      </w:pPr>
-      <w:r>
-        <w:t xml:space="preserve">7) </w:t>
-      </w:r>
-      <w:r>
-        <w:rPr>
-          <w:b/>
-          <w:bCs/>
-        </w:rPr>
-        <w:t xml:space="preserve">Верно.</w:t>
-      </w:r>
-      <w:r>
-        <w:t xml:space="preserve"> aₓ &lt; 0, поэтому ветви вниз. В момент t = 10 с vₓ = 0, поэтому это вершина: касательная горизонтальна.</w:t>
-      </w:r>
-    </w:p>
-    <w:p>
-      <w:pPr>
-        <w:spacing w:after="80"/>
-        <w:ind w:left="360" w:hanging="360"/>
-      </w:pPr>
-      <w:r>
-        <w:t xml:space="preserve">8) </w:t>
-      </w:r>
-      <w:r>
-        <w:rPr>
-          <w:b/>
-          <w:bCs/>
-        </w:rPr>
-        <w:t xml:space="preserve">Неверно.</w:t>
-      </w:r>
-      <w:r>
-        <w:t xml:space="preserve"> В формуле x = x₀ + v₀ₓt + aₓt²/2 перед t² стоит aₓ/2 = 1. Правильно: x = 4 − 4t + t².</w:t>
-      </w:r>
-    </w:p>
-    <w:p>
-      <w:pPr>
-        <w:pStyle w:val="Heading2"/>
-      </w:pPr>
-      <w:r>
-        <w:t xml:space="preserve">Задание 2</w:t>
-      </w:r>
-    </w:p>
-    <w:p>
-      <w:pPr>
-        <w:pBdr>
-          <w:left w:val="single" w:color="2E5C9A" w:sz="18" w:space="6"/>
-        </w:pBdr>
-        <w:shd w:fill="EAF1FB" w:val="clear"/>
-        <w:spacing w:after="120" w:before="120"/>
-      </w:pPr>
-      <w:r>
-        <w:rPr>
-          <w:b/>
-          <w:bCs/>
-        </w:rPr>
-        <w:t xml:space="preserve">Ответ: 1, 2, 4, 7, 8</w:t>
-      </w:r>
-    </w:p>
-    <w:p>
-      <w:pPr>
-        <w:spacing w:after="100"/>
-      </w:pPr>
-      <w:r>
-        <w:rPr>
-          <w:b/>
-          <w:bCs/>
-        </w:rPr>
-        <w:t xml:space="preserve">Данные с графиков.</w:t>
-      </w:r>
-      <w:r>
-        <w:t xml:space="preserve"> x₀ = −6 м, v₀ₓ = 0. aₓ: 3 м/с² (0–2 с), 0 (2–4 с), −3 м/с² (4–8 с), 0 (8–10 с).</w:t>
-      </w:r>
-    </w:p>
-    <w:p>
-      <w:pPr>
-        <w:spacing w:after="80"/>
-        <w:ind w:left="360" w:hanging="360"/>
-      </w:pPr>
-      <w:r>
-        <w:t xml:space="preserve">1) </w:t>
-      </w:r>
-      <w:r>
-        <w:rPr>
-          <w:b/>
-          <w:bCs/>
-        </w:rPr>
-        <w:t xml:space="preserve">Верно.</w:t>
-      </w:r>
-      <w:r>
-        <w:t xml:space="preserve"> x(2) = −6 + 3·2²/2 = 0. Дальше: x(4) = 0 + 6·2 = 12 м, x(8) = 12 + (площадь 4–8 с, она равна 0) = 12 м, x(10) = 12 − 6·2 = 0. Больше координата нулю не равна.</w:t>
-      </w:r>
-    </w:p>
-    <w:p>
-      <w:pPr>
-        <w:spacing w:after="80"/>
-        <w:ind w:left="360" w:hanging="360"/>
-      </w:pPr>
-      <w:r>
-        <w:t xml:space="preserve">2) </w:t>
-      </w:r>
-      <w:r>
-        <w:rPr>
-          <w:b/>
-          <w:bCs/>
-        </w:rPr>
-        <w:t xml:space="preserve">Верно.</w:t>
-      </w:r>
-      <w:r>
-        <w:t xml:space="preserve"> Максимум координаты там, где vₓ = 0 и меняет знак с «+» на «−», то есть при t = 6 с. x(6) = 12 + 6·2/2 = 18 м.</w:t>
-      </w:r>
-    </w:p>
-    <w:p>
-      <w:pPr>
-        <w:spacing w:after="80"/>
-        <w:ind w:left="360" w:hanging="360"/>
-      </w:pPr>
-      <w:r>
-        <w:t xml:space="preserve">3) </w:t>
-      </w:r>
-      <w:r>
-        <w:rPr>
-          <w:b/>
-          <w:bCs/>
-        </w:rPr>
-        <w:t xml:space="preserve">Неверно.</w:t>
-      </w:r>
-      <w:r>
-        <w:t xml:space="preserve"> На 4–8 с: |a| = 12/4 = 3 м/с². На 0–2 с: |a| = 6/2 = 3 м/с². Они равны.</w:t>
-      </w:r>
-    </w:p>
-    <w:p>
-      <w:pPr>
-        <w:spacing w:after="80"/>
-        <w:ind w:left="360" w:hanging="360"/>
-      </w:pPr>
-      <w:r>
-        <w:t xml:space="preserve">4) </w:t>
-      </w:r>
-      <w:r>
-        <w:rPr>
-          <w:b/>
-          <w:bCs/>
-        </w:rPr>
-        <w:t xml:space="preserve">Верно.</w:t>
-      </w:r>
-      <w:r>
-        <w:t xml:space="preserve"> 6 + 12 + 6 + 6 + 12 = 42 м (участки 0–2, 2–4, 4–6, 6–8, 8–10 с).</w:t>
-      </w:r>
-    </w:p>
-    <w:p>
-      <w:pPr>
-        <w:spacing w:after="80"/>
-        <w:ind w:left="360" w:hanging="360"/>
-      </w:pPr>
-      <w:r>
-        <w:t xml:space="preserve">5) </w:t>
-      </w:r>
-      <w:r>
-        <w:rPr>
-          <w:b/>
-          <w:bCs/>
-        </w:rPr>
-        <w:t xml:space="preserve">Неверно.</w:t>
-      </w:r>
-      <w:r>
-        <w:t xml:space="preserve"> Ловушка: в конце x = 0, но перемещение — это x(10) − x(0) = 0 − (−6) = 6 м, а не координата.</w:t>
-      </w:r>
-    </w:p>
-    <w:p>
-      <w:pPr>
-        <w:spacing w:after="80"/>
-        <w:ind w:left="360" w:hanging="360"/>
-      </w:pPr>
-      <w:r>
-        <w:t xml:space="preserve">6) </w:t>
-      </w:r>
-      <w:r>
-        <w:rPr>
-          <w:b/>
-          <w:bCs/>
-        </w:rPr>
-        <w:t xml:space="preserve">Неверно.</w:t>
-      </w:r>
-      <w:r>
-        <w:t xml:space="preserve"> На 4–6 с vₓ &gt; 0, aₓ &lt; 0, знаки разные — тело тормозит. На 6–8 с vₓ &lt; 0, aₓ &lt; 0, знаки одинаковые — тело разгоняется в обратную сторону.</w:t>
-      </w:r>
-    </w:p>
-    <w:p>
-      <w:pPr>
-        <w:spacing w:after="80"/>
-        <w:ind w:left="360" w:hanging="360"/>
-      </w:pPr>
-      <w:r>
-        <w:t xml:space="preserve">7) </w:t>
-      </w:r>
-      <w:r>
-        <w:rPr>
-          <w:b/>
-          <w:bCs/>
-        </w:rPr>
-        <w:t xml:space="preserve">Верно.</w:t>
-      </w:r>
-      <w:r>
-        <w:t xml:space="preserve"> |Δx| / t = 6 / 10 = 0,6 м/с.</w:t>
-      </w:r>
-    </w:p>
-    <w:p>
-      <w:pPr>
-        <w:spacing w:after="80"/>
-        <w:ind w:left="360" w:hanging="360"/>
-      </w:pPr>
-      <w:r>
-        <w:t xml:space="preserve">8) </w:t>
-      </w:r>
-      <w:r>
-        <w:rPr>
-          <w:b/>
-          <w:bCs/>
-        </w:rPr>
-        <w:t xml:space="preserve">Верно.</w:t>
-      </w:r>
-      <w:r>
-        <w:t xml:space="preserve"> vₓ = 6 − 3·(7 − 4) = −3 м/с. Это видно и прямо по графику.</w:t>
-      </w:r>
-    </w:p>
-    <w:p>
-      <w:pPr>
-        <w:pStyle w:val="Heading2"/>
-      </w:pPr>
-      <w:r>
-        <w:t xml:space="preserve">Задание 3</w:t>
-      </w:r>
-    </w:p>
-    <w:p>
-      <w:pPr>
-        <w:pBdr>
-          <w:left w:val="single" w:color="2E5C9A" w:sz="18" w:space="6"/>
-        </w:pBdr>
-        <w:shd w:fill="EAF1FB" w:val="clear"/>
-        <w:spacing w:after="120" w:before="120"/>
-      </w:pPr>
-      <w:r>
-        <w:rPr>
-          <w:b/>
-          <w:bCs/>
-        </w:rPr>
-        <w:t xml:space="preserve">Ответ: 1, 2, 3, 4, 7, 9</w:t>
-      </w:r>
-    </w:p>
-    <w:p>
-      <w:pPr>
-        <w:spacing w:after="100"/>
-      </w:pPr>
-      <w:r>
-        <w:rPr>
-          <w:b/>
-          <w:bCs/>
-        </w:rPr>
-        <w:t xml:space="preserve">Ищем ошибку.</w:t>
-      </w:r>
-      <w:r>
-        <w:t xml:space="preserve"> Сравниваем графики попарно на каждом участке.</w:t>
-      </w:r>
-    </w:p>
-    <w:p>
-      <w:pPr>
-        <w:pStyle w:val="ListParagraph"/>
-        <w:numPr>
-          <w:ilvl w:val="0"/>
-          <w:numId w:val="2"/>
-        </w:numPr>
-        <w:spacing w:after="60"/>
-      </w:pPr>
-      <w:r>
-        <w:t xml:space="preserve">0–6 с: наклон vₓ(t) равен (6 − (−3)) / 6 = 1,5 м/с². Это совпадает с aₓ(t). x(6) = 2 − 3·6 + 0,75·36 = 11 м — совпадает с x(t).</w:t>
-      </w:r>
-    </w:p>
-    <w:p>
-      <w:pPr>
-        <w:pStyle w:val="ListParagraph"/>
-        <w:numPr>
-          <w:ilvl w:val="0"/>
-          <w:numId w:val="2"/>
-        </w:numPr>
-        <w:spacing w:after="60"/>
-      </w:pPr>
-      <w:r>
-        <w:t xml:space="preserve">6–9 с: наклон vₓ(t) равен (0 − 6) / 3 = −2 м/с², а на графике aₓ(t) стоит −3 м/с². Значит, один из графиков неверный.</w:t>
-      </w:r>
-    </w:p>
-    <w:p>
-      <w:pPr>
-        <w:pStyle w:val="ListParagraph"/>
-        <w:numPr>
-          <w:ilvl w:val="0"/>
-          <w:numId w:val="2"/>
-        </w:numPr>
-        <w:spacing w:after="60"/>
-      </w:pPr>
-      <w:r>
-        <w:t xml:space="preserve">Проверим по x(t): за 6–9 с координата выросла с 11 до 20 м, то есть на 9 м. Площадь под vₓ(t): 6·3/2 = 9 м. График скорости согласован с x(t), значит ошибка в aₓ(t). На этом участке должно быть aₓ = −2 м/с².</w:t>
-      </w:r>
-    </w:p>
-    <w:p>
-      <w:pPr>
-        <w:spacing w:after="80"/>
-        <w:ind w:left="360" w:hanging="360"/>
-      </w:pPr>
-      <w:r>
-        <w:t xml:space="preserve">1) </w:t>
-      </w:r>
-      <w:r>
-        <w:rPr>
-          <w:b/>
-          <w:bCs/>
-        </w:rPr>
-        <w:t xml:space="preserve">Верно</w:t>
-      </w:r>
-      <w:r>
-        <w:t xml:space="preserve"> (см. выше).</w:t>
-      </w:r>
-    </w:p>
-    <w:p>
-      <w:pPr>
-        <w:spacing w:after="80"/>
-        <w:ind w:left="360" w:hanging="360"/>
-      </w:pPr>
-      <w:r>
-        <w:t xml:space="preserve">2) </w:t>
-      </w:r>
-      <w:r>
-        <w:rPr>
-          <w:b/>
-          <w:bCs/>
-        </w:rPr>
-        <w:t xml:space="preserve">Верно.</w:t>
-      </w:r>
-      <w:r>
-        <w:t xml:space="preserve"> vₓ(2) = 0 (пересечение с осью t), на 9–10 с график vₓ(t) лежит на нуле, а x(t) горизонтален.</w:t>
-      </w:r>
-    </w:p>
-    <w:p>
-      <w:pPr>
-        <w:spacing w:after="80"/>
-        <w:ind w:left="360" w:hanging="360"/>
-      </w:pPr>
-      <w:r>
-        <w:t xml:space="preserve">3) </w:t>
-      </w:r>
-      <w:r>
-        <w:rPr>
-          <w:b/>
-          <w:bCs/>
-        </w:rPr>
-        <w:t xml:space="preserve">Верно.</w:t>
-      </w:r>
-      <w:r>
-        <w:t xml:space="preserve"> Минимум при t = 2 с: x(2) = 2 + (−3·2/2) = −1 м.</w:t>
-      </w:r>
-    </w:p>
-    <w:p>
-      <w:pPr>
-        <w:spacing w:after="80"/>
-        <w:ind w:left="360" w:hanging="360"/>
-      </w:pPr>
-      <w:r>
-        <w:t xml:space="preserve">4) </w:t>
-      </w:r>
-      <w:r>
-        <w:rPr>
-          <w:b/>
-          <w:bCs/>
-        </w:rPr>
-        <w:t xml:space="preserve">Верно.</w:t>
-      </w:r>
-      <w:r>
-        <w:t xml:space="preserve"> 3 (0–2 с) + 6·4/2 = 12 (2–6 с) + 9 (6–9 с) + 0 = 24 м.</w:t>
-      </w:r>
-    </w:p>
-    <w:p>
-      <w:pPr>
-        <w:spacing w:after="80"/>
-        <w:ind w:left="360" w:hanging="360"/>
-      </w:pPr>
-      <w:r>
-        <w:t xml:space="preserve">5) </w:t>
-      </w:r>
-      <w:r>
-        <w:rPr>
-          <w:b/>
-          <w:bCs/>
-        </w:rPr>
-        <w:t xml:space="preserve">Неверно.</w:t>
-      </w:r>
-      <w:r>
-        <w:t xml:space="preserve"> Перемещение = 20 − 2 = 18 м. 24 м — это путь.</w:t>
-      </w:r>
-    </w:p>
-    <w:p>
-      <w:pPr>
-        <w:spacing w:after="80"/>
-        <w:ind w:left="360" w:hanging="360"/>
-      </w:pPr>
-      <w:r>
-        <w:t xml:space="preserve">6) </w:t>
-      </w:r>
-      <w:r>
-        <w:rPr>
-          <w:b/>
-          <w:bCs/>
-        </w:rPr>
-        <w:t xml:space="preserve">Неверно.</w:t>
-      </w:r>
-      <w:r>
-        <w:t xml:space="preserve"> Правильное значение |a| = 2 м/с². 3 м/с² — значение с ошибочного графика.</w:t>
-      </w:r>
-    </w:p>
-    <w:p>
-      <w:pPr>
-        <w:spacing w:after="80"/>
-        <w:ind w:left="360" w:hanging="360"/>
-      </w:pPr>
-      <w:r>
-        <w:t xml:space="preserve">7) </w:t>
-      </w:r>
-      <w:r>
-        <w:rPr>
-          <w:b/>
-          <w:bCs/>
-        </w:rPr>
-        <w:t xml:space="preserve">Верно.</w:t>
-      </w:r>
-      <w:r>
-        <w:t xml:space="preserve"> Координата начинается с +2 м, опускается до −1 м и снова растёт. Ось x = 0 пересекается дважды: примерно при t ≈ 0,85 с и t ≈ 3,15 с.</w:t>
-      </w:r>
-    </w:p>
-    <w:p>
-      <w:pPr>
-        <w:spacing w:after="80"/>
-        <w:ind w:left="360" w:hanging="360"/>
-      </w:pPr>
-      <w:r>
-        <w:t xml:space="preserve">8) </w:t>
-      </w:r>
-      <w:r>
-        <w:rPr>
-          <w:b/>
-          <w:bCs/>
-        </w:rPr>
-        <w:t xml:space="preserve">Неверно.</w:t>
-      </w:r>
-      <w:r>
-        <w:t xml:space="preserve"> Путь за 6 с = 3 + 12 = 15 м, путевая скорость 15/6 = 2,5 м/с. 1,5 м/с = (11 − 2)/6 — это средняя скорость перемещения.</w:t>
-      </w:r>
-    </w:p>
-    <w:p>
-      <w:pPr>
-        <w:spacing w:after="80"/>
-        <w:ind w:left="360" w:hanging="360"/>
-      </w:pPr>
-      <w:r>
-        <w:t xml:space="preserve">9) </w:t>
-      </w:r>
-      <w:r>
-        <w:rPr>
-          <w:b/>
-          <w:bCs/>
-        </w:rPr>
-        <w:t xml:space="preserve">Верно.</w:t>
-      </w:r>
-      <w:r>
-        <w:t xml:space="preserve"> x₀ = 2, v₀ₓ = −3, aₓ/2 = 0,75.</w:t>
+        <w:t xml:space="preserve">9) В момент t = 10 с координата тела равна 20 м.</w:t>
       </w:r>
     </w:p>
     <w:p>

</xml_diff>